<commit_message>
API Dokumentáció: Admin funkciók
</commit_message>
<xml_diff>
--- a/API_Dokumentacio_MaturaSmart.docx
+++ b/API_Dokumentacio_MaturaSmart.docx
@@ -447,8 +447,8 @@
           <w:lang w:eastAsia="hu-HU"/>
           <w14:ligatures w14:val="none"/>
         </w:rPr>
-        <w:pict w14:anchorId="761A5109">
-          <v:rect id="_x0000_i1029" style="width:0;height:1.5pt" o:hralign="center" o:hrstd="t" o:hr="t" fillcolor="#a0a0a0" stroked="f"/>
+        <w:pict w14:anchorId="4339EEC0">
+          <v:rect id="_x0000_i1037" style="width:0;height:1.5pt" o:hralign="center" o:hrstd="t" o:hr="t" fillcolor="#a0a0a0" stroked="f"/>
         </w:pict>
       </w:r>
     </w:p>
@@ -872,8 +872,8 @@
           <w:lang w:eastAsia="hu-HU"/>
           <w14:ligatures w14:val="none"/>
         </w:rPr>
-        <w:pict w14:anchorId="6AA3C0C6">
-          <v:rect id="_x0000_i1030" style="width:0;height:1.5pt" o:hralign="center" o:hrstd="t" o:hr="t" fillcolor="#a0a0a0" stroked="f"/>
+        <w:pict w14:anchorId="20891118">
+          <v:rect id="_x0000_i1038" style="width:0;height:1.5pt" o:hralign="center" o:hrstd="t" o:hr="t" fillcolor="#a0a0a0" stroked="f"/>
         </w:pict>
       </w:r>
     </w:p>
@@ -1535,8 +1535,8 @@
           <w:lang w:eastAsia="hu-HU"/>
           <w14:ligatures w14:val="none"/>
         </w:rPr>
-        <w:pict w14:anchorId="27276B89">
-          <v:rect id="_x0000_i1031" style="width:0;height:1.5pt" o:hralign="center" o:hrstd="t" o:hr="t" fillcolor="#a0a0a0" stroked="f"/>
+        <w:pict w14:anchorId="45619B49">
+          <v:rect id="_x0000_i1039" style="width:0;height:1.5pt" o:hralign="center" o:hrstd="t" o:hr="t" fillcolor="#a0a0a0" stroked="f"/>
         </w:pict>
       </w:r>
     </w:p>
@@ -2552,8 +2552,8 @@
           <w:lang w:eastAsia="hu-HU"/>
           <w14:ligatures w14:val="none"/>
         </w:rPr>
-        <w:pict w14:anchorId="2E55270F">
-          <v:rect id="_x0000_i1032" style="width:0;height:1.5pt" o:hralign="center" o:hrstd="t" o:hr="t" fillcolor="#a0a0a0" stroked="f"/>
+        <w:pict w14:anchorId="4C8F29FE">
+          <v:rect id="_x0000_i1040" style="width:0;height:1.5pt" o:hralign="center" o:hrstd="t" o:hr="t" fillcolor="#a0a0a0" stroked="f"/>
         </w:pict>
       </w:r>
     </w:p>
@@ -3690,8 +3690,8 @@
           <w:lang w:eastAsia="hu-HU"/>
           <w14:ligatures w14:val="none"/>
         </w:rPr>
-        <w:pict w14:anchorId="13C83E72">
-          <v:rect id="_x0000_i1033" style="width:0;height:1.5pt" o:hralign="center" o:hrstd="t" o:hr="t" fillcolor="#a0a0a0" stroked="f"/>
+        <w:pict w14:anchorId="2B4AD363">
+          <v:rect id="_x0000_i1041" style="width:0;height:1.5pt" o:hralign="center" o:hrstd="t" o:hr="t" fillcolor="#a0a0a0" stroked="f"/>
         </w:pict>
       </w:r>
     </w:p>
@@ -4704,8 +4704,8 @@
           <w:lang w:eastAsia="hu-HU"/>
           <w14:ligatures w14:val="none"/>
         </w:rPr>
-        <w:pict w14:anchorId="041066A5">
-          <v:rect id="_x0000_i1034" style="width:0;height:1.5pt" o:hralign="center" o:hrstd="t" o:hr="t" fillcolor="#a0a0a0" stroked="f"/>
+        <w:pict w14:anchorId="709C35D5">
+          <v:rect id="_x0000_i1042" style="width:0;height:1.5pt" o:hralign="center" o:hrstd="t" o:hr="t" fillcolor="#a0a0a0" stroked="f"/>
         </w:pict>
       </w:r>
     </w:p>
@@ -5455,6 +5455,1605 @@
                 <w14:ligatures w14:val="none"/>
               </w:rPr>
               <w:t>200</w:t>
+            </w:r>
+          </w:p>
+        </w:tc>
+      </w:tr>
+    </w:tbl>
+    <w:p>
+      <w:pPr>
+        <w:spacing w:after="0" w:line="240" w:lineRule="auto"/>
+        <w:rPr>
+          <w:rFonts w:ascii="Times New Roman" w:eastAsia="Times New Roman" w:hAnsi="Times New Roman" w:cs="Times New Roman"/>
+          <w:kern w:val="0"/>
+          <w:lang w:eastAsia="hu-HU"/>
+          <w14:ligatures w14:val="none"/>
+        </w:rPr>
+      </w:pPr>
+      <w:r>
+        <w:rPr>
+          <w:rFonts w:ascii="Times New Roman" w:eastAsia="Times New Roman" w:hAnsi="Times New Roman" w:cs="Times New Roman"/>
+          <w:kern w:val="0"/>
+          <w:lang w:eastAsia="hu-HU"/>
+          <w14:ligatures w14:val="none"/>
+        </w:rPr>
+        <w:pict w14:anchorId="33CA276A">
+          <v:rect id="_x0000_i1043" style="width:0;height:1.5pt" o:hralign="center" o:hrstd="t" o:hr="t" fillcolor="#a0a0a0" stroked="f"/>
+        </w:pict>
+      </w:r>
+    </w:p>
+    <w:p>
+      <w:pPr>
+        <w:rPr>
+          <w:rFonts w:ascii="Times New Roman" w:eastAsia="Times New Roman" w:hAnsi="Times New Roman" w:cs="Times New Roman"/>
+          <w:b/>
+          <w:bCs/>
+          <w:kern w:val="0"/>
+          <w:sz w:val="36"/>
+          <w:szCs w:val="36"/>
+          <w:lang w:eastAsia="hu-HU"/>
+          <w14:ligatures w14:val="none"/>
+        </w:rPr>
+      </w:pPr>
+      <w:r>
+        <w:rPr>
+          <w:rFonts w:ascii="Times New Roman" w:eastAsia="Times New Roman" w:hAnsi="Times New Roman" w:cs="Times New Roman"/>
+          <w:b/>
+          <w:bCs/>
+          <w:kern w:val="0"/>
+          <w:sz w:val="36"/>
+          <w:szCs w:val="36"/>
+          <w:lang w:eastAsia="hu-HU"/>
+          <w14:ligatures w14:val="none"/>
+        </w:rPr>
+        <w:br w:type="page"/>
+      </w:r>
+    </w:p>
+    <w:p>
+      <w:pPr>
+        <w:spacing w:before="100" w:beforeAutospacing="1" w:after="100" w:afterAutospacing="1" w:line="240" w:lineRule="auto"/>
+        <w:outlineLvl w:val="1"/>
+        <w:rPr>
+          <w:rFonts w:ascii="Times New Roman" w:eastAsia="Times New Roman" w:hAnsi="Times New Roman" w:cs="Times New Roman"/>
+          <w:b/>
+          <w:bCs/>
+          <w:kern w:val="0"/>
+          <w:sz w:val="36"/>
+          <w:szCs w:val="36"/>
+          <w:lang w:eastAsia="hu-HU"/>
+          <w14:ligatures w14:val="none"/>
+        </w:rPr>
+      </w:pPr>
+      <w:r>
+        <w:rPr>
+          <w:rFonts w:ascii="Times New Roman" w:eastAsia="Times New Roman" w:hAnsi="Times New Roman" w:cs="Times New Roman"/>
+          <w:b/>
+          <w:bCs/>
+          <w:kern w:val="0"/>
+          <w:sz w:val="36"/>
+          <w:szCs w:val="36"/>
+          <w:lang w:eastAsia="hu-HU"/>
+          <w14:ligatures w14:val="none"/>
+        </w:rPr>
+        <w:lastRenderedPageBreak/>
+        <w:t>2.5 Adminisztrátori funkciók</w:t>
+      </w:r>
+    </w:p>
+    <w:tbl>
+      <w:tblPr>
+        <w:tblW w:w="0" w:type="auto"/>
+        <w:tblCellSpacing w:w="15" w:type="dxa"/>
+        <w:tblCellMar>
+          <w:top w:w="15" w:type="dxa"/>
+          <w:left w:w="15" w:type="dxa"/>
+          <w:bottom w:w="15" w:type="dxa"/>
+          <w:right w:w="15" w:type="dxa"/>
+        </w:tblCellMar>
+        <w:tblLook w:val="04A0" w:firstRow="1" w:lastRow="0" w:firstColumn="1" w:lastColumn="0" w:noHBand="0" w:noVBand="1"/>
+      </w:tblPr>
+      <w:tblGrid>
+        <w:gridCol w:w="982"/>
+        <w:gridCol w:w="3477"/>
+        <w:gridCol w:w="2286"/>
+        <w:gridCol w:w="1322"/>
+      </w:tblGrid>
+      <w:tr>
+        <w:trPr>
+          <w:tblHeader/>
+          <w:tblCellSpacing w:w="15" w:type="dxa"/>
+        </w:trPr>
+        <w:tc>
+          <w:tcPr>
+            <w:tcW w:w="0" w:type="auto"/>
+            <w:vAlign w:val="center"/>
+            <w:hideMark/>
+          </w:tcPr>
+          <w:p>
+            <w:pPr>
+              <w:spacing w:after="0" w:line="240" w:lineRule="auto"/>
+              <w:jc w:val="center"/>
+              <w:rPr>
+                <w:rFonts w:ascii="Times New Roman" w:eastAsia="Times New Roman" w:hAnsi="Times New Roman" w:cs="Times New Roman"/>
+                <w:b/>
+                <w:bCs/>
+                <w:kern w:val="0"/>
+                <w:lang w:eastAsia="hu-HU"/>
+                <w14:ligatures w14:val="none"/>
+              </w:rPr>
+            </w:pPr>
+            <w:r>
+              <w:rPr>
+                <w:rFonts w:ascii="Times New Roman" w:eastAsia="Times New Roman" w:hAnsi="Times New Roman" w:cs="Times New Roman"/>
+                <w:b/>
+                <w:bCs/>
+                <w:kern w:val="0"/>
+                <w:lang w:eastAsia="hu-HU"/>
+                <w14:ligatures w14:val="none"/>
+              </w:rPr>
+              <w:t>Módszer</w:t>
+            </w:r>
+          </w:p>
+        </w:tc>
+        <w:tc>
+          <w:tcPr>
+            <w:tcW w:w="0" w:type="auto"/>
+            <w:vAlign w:val="center"/>
+            <w:hideMark/>
+          </w:tcPr>
+          <w:p>
+            <w:pPr>
+              <w:spacing w:after="0" w:line="240" w:lineRule="auto"/>
+              <w:jc w:val="center"/>
+              <w:rPr>
+                <w:rFonts w:ascii="Times New Roman" w:eastAsia="Times New Roman" w:hAnsi="Times New Roman" w:cs="Times New Roman"/>
+                <w:b/>
+                <w:bCs/>
+                <w:kern w:val="0"/>
+                <w:lang w:eastAsia="hu-HU"/>
+                <w14:ligatures w14:val="none"/>
+              </w:rPr>
+            </w:pPr>
+            <w:proofErr w:type="spellStart"/>
+            <w:r>
+              <w:rPr>
+                <w:rFonts w:ascii="Times New Roman" w:eastAsia="Times New Roman" w:hAnsi="Times New Roman" w:cs="Times New Roman"/>
+                <w:b/>
+                <w:bCs/>
+                <w:kern w:val="0"/>
+                <w:lang w:eastAsia="hu-HU"/>
+                <w14:ligatures w14:val="none"/>
+              </w:rPr>
+              <w:t>Endpoint</w:t>
+            </w:r>
+            <w:proofErr w:type="spellEnd"/>
+          </w:p>
+        </w:tc>
+        <w:tc>
+          <w:tcPr>
+            <w:tcW w:w="0" w:type="auto"/>
+            <w:vAlign w:val="center"/>
+            <w:hideMark/>
+          </w:tcPr>
+          <w:p>
+            <w:pPr>
+              <w:spacing w:after="0" w:line="240" w:lineRule="auto"/>
+              <w:jc w:val="center"/>
+              <w:rPr>
+                <w:rFonts w:ascii="Times New Roman" w:eastAsia="Times New Roman" w:hAnsi="Times New Roman" w:cs="Times New Roman"/>
+                <w:b/>
+                <w:bCs/>
+                <w:kern w:val="0"/>
+                <w:lang w:eastAsia="hu-HU"/>
+                <w14:ligatures w14:val="none"/>
+              </w:rPr>
+            </w:pPr>
+            <w:r>
+              <w:rPr>
+                <w:rFonts w:ascii="Times New Roman" w:eastAsia="Times New Roman" w:hAnsi="Times New Roman" w:cs="Times New Roman"/>
+                <w:b/>
+                <w:bCs/>
+                <w:kern w:val="0"/>
+                <w:lang w:eastAsia="hu-HU"/>
+                <w14:ligatures w14:val="none"/>
+              </w:rPr>
+              <w:t>Leírás</w:t>
+            </w:r>
+          </w:p>
+        </w:tc>
+        <w:tc>
+          <w:tcPr>
+            <w:tcW w:w="0" w:type="auto"/>
+            <w:vAlign w:val="center"/>
+            <w:hideMark/>
+          </w:tcPr>
+          <w:p>
+            <w:pPr>
+              <w:spacing w:after="0" w:line="240" w:lineRule="auto"/>
+              <w:jc w:val="center"/>
+              <w:rPr>
+                <w:rFonts w:ascii="Times New Roman" w:eastAsia="Times New Roman" w:hAnsi="Times New Roman" w:cs="Times New Roman"/>
+                <w:b/>
+                <w:bCs/>
+                <w:kern w:val="0"/>
+                <w:lang w:eastAsia="hu-HU"/>
+                <w14:ligatures w14:val="none"/>
+              </w:rPr>
+            </w:pPr>
+            <w:r>
+              <w:rPr>
+                <w:rFonts w:ascii="Times New Roman" w:eastAsia="Times New Roman" w:hAnsi="Times New Roman" w:cs="Times New Roman"/>
+                <w:b/>
+                <w:bCs/>
+                <w:kern w:val="0"/>
+                <w:lang w:eastAsia="hu-HU"/>
+                <w14:ligatures w14:val="none"/>
+              </w:rPr>
+              <w:t>Auth kell?</w:t>
+            </w:r>
+          </w:p>
+        </w:tc>
+      </w:tr>
+      <w:tr>
+        <w:trPr>
+          <w:tblCellSpacing w:w="15" w:type="dxa"/>
+        </w:trPr>
+        <w:tc>
+          <w:tcPr>
+            <w:tcW w:w="0" w:type="auto"/>
+            <w:vAlign w:val="center"/>
+            <w:hideMark/>
+          </w:tcPr>
+          <w:p>
+            <w:pPr>
+              <w:spacing w:after="0" w:line="240" w:lineRule="auto"/>
+              <w:rPr>
+                <w:rFonts w:ascii="Times New Roman" w:eastAsia="Times New Roman" w:hAnsi="Times New Roman" w:cs="Times New Roman"/>
+                <w:kern w:val="0"/>
+                <w:lang w:eastAsia="hu-HU"/>
+                <w14:ligatures w14:val="none"/>
+              </w:rPr>
+            </w:pPr>
+            <w:r>
+              <w:rPr>
+                <w:rFonts w:ascii="Times New Roman" w:eastAsia="Times New Roman" w:hAnsi="Times New Roman" w:cs="Times New Roman"/>
+                <w:kern w:val="0"/>
+                <w:lang w:eastAsia="hu-HU"/>
+                <w14:ligatures w14:val="none"/>
+              </w:rPr>
+              <w:t>GET</w:t>
+            </w:r>
+          </w:p>
+        </w:tc>
+        <w:tc>
+          <w:tcPr>
+            <w:tcW w:w="0" w:type="auto"/>
+            <w:vAlign w:val="center"/>
+            <w:hideMark/>
+          </w:tcPr>
+          <w:p>
+            <w:pPr>
+              <w:spacing w:after="0" w:line="240" w:lineRule="auto"/>
+              <w:rPr>
+                <w:rFonts w:ascii="Times New Roman" w:eastAsia="Times New Roman" w:hAnsi="Times New Roman" w:cs="Times New Roman"/>
+                <w:kern w:val="0"/>
+                <w:lang w:eastAsia="hu-HU"/>
+                <w14:ligatures w14:val="none"/>
+              </w:rPr>
+            </w:pPr>
+            <w:proofErr w:type="spellStart"/>
+            <w:r>
+              <w:rPr>
+                <w:rFonts w:ascii="Times New Roman" w:eastAsia="Times New Roman" w:hAnsi="Times New Roman" w:cs="Times New Roman"/>
+                <w:kern w:val="0"/>
+                <w:lang w:eastAsia="hu-HU"/>
+                <w14:ligatures w14:val="none"/>
+              </w:rPr>
+              <w:t>api</w:t>
+            </w:r>
+            <w:proofErr w:type="spellEnd"/>
+            <w:r>
+              <w:rPr>
+                <w:rFonts w:ascii="Times New Roman" w:eastAsia="Times New Roman" w:hAnsi="Times New Roman" w:cs="Times New Roman"/>
+                <w:kern w:val="0"/>
+                <w:lang w:eastAsia="hu-HU"/>
+                <w14:ligatures w14:val="none"/>
+              </w:rPr>
+              <w:t>/</w:t>
+            </w:r>
+            <w:proofErr w:type="spellStart"/>
+            <w:r>
+              <w:rPr>
+                <w:rFonts w:ascii="Times New Roman" w:eastAsia="Times New Roman" w:hAnsi="Times New Roman" w:cs="Times New Roman"/>
+                <w:kern w:val="0"/>
+                <w:lang w:eastAsia="hu-HU"/>
+                <w14:ligatures w14:val="none"/>
+              </w:rPr>
+              <w:t>admin</w:t>
+            </w:r>
+            <w:proofErr w:type="spellEnd"/>
+            <w:r>
+              <w:rPr>
+                <w:rFonts w:ascii="Times New Roman" w:eastAsia="Times New Roman" w:hAnsi="Times New Roman" w:cs="Times New Roman"/>
+                <w:kern w:val="0"/>
+                <w:lang w:eastAsia="hu-HU"/>
+                <w14:ligatures w14:val="none"/>
+              </w:rPr>
+              <w:t>/</w:t>
+            </w:r>
+            <w:proofErr w:type="spellStart"/>
+            <w:r>
+              <w:rPr>
+                <w:rFonts w:ascii="Times New Roman" w:eastAsia="Times New Roman" w:hAnsi="Times New Roman" w:cs="Times New Roman"/>
+                <w:kern w:val="0"/>
+                <w:lang w:eastAsia="hu-HU"/>
+                <w14:ligatures w14:val="none"/>
+              </w:rPr>
+              <w:t>stats</w:t>
+            </w:r>
+            <w:proofErr w:type="spellEnd"/>
+          </w:p>
+        </w:tc>
+        <w:tc>
+          <w:tcPr>
+            <w:tcW w:w="0" w:type="auto"/>
+            <w:vAlign w:val="center"/>
+            <w:hideMark/>
+          </w:tcPr>
+          <w:p>
+            <w:pPr>
+              <w:spacing w:after="0" w:line="240" w:lineRule="auto"/>
+              <w:rPr>
+                <w:rFonts w:ascii="Times New Roman" w:eastAsia="Times New Roman" w:hAnsi="Times New Roman" w:cs="Times New Roman"/>
+                <w:kern w:val="0"/>
+                <w:lang w:eastAsia="hu-HU"/>
+                <w14:ligatures w14:val="none"/>
+              </w:rPr>
+            </w:pPr>
+            <w:r>
+              <w:rPr>
+                <w:rFonts w:ascii="Times New Roman" w:eastAsia="Times New Roman" w:hAnsi="Times New Roman" w:cs="Times New Roman"/>
+                <w:kern w:val="0"/>
+                <w:lang w:eastAsia="hu-HU"/>
+                <w14:ligatures w14:val="none"/>
+              </w:rPr>
+              <w:t>Rendszer statisztikák</w:t>
+            </w:r>
+          </w:p>
+        </w:tc>
+        <w:tc>
+          <w:tcPr>
+            <w:tcW w:w="0" w:type="auto"/>
+            <w:vAlign w:val="center"/>
+            <w:hideMark/>
+          </w:tcPr>
+          <w:p>
+            <w:pPr>
+              <w:spacing w:after="0" w:line="240" w:lineRule="auto"/>
+              <w:rPr>
+                <w:rFonts w:ascii="Times New Roman" w:eastAsia="Times New Roman" w:hAnsi="Times New Roman" w:cs="Times New Roman"/>
+                <w:kern w:val="0"/>
+                <w:lang w:eastAsia="hu-HU"/>
+                <w14:ligatures w14:val="none"/>
+              </w:rPr>
+            </w:pPr>
+            <w:r>
+              <w:rPr>
+                <w:rFonts w:ascii="Times New Roman" w:eastAsia="Times New Roman" w:hAnsi="Times New Roman" w:cs="Times New Roman"/>
+                <w:kern w:val="0"/>
+                <w:lang w:eastAsia="hu-HU"/>
+                <w14:ligatures w14:val="none"/>
+              </w:rPr>
+              <w:t>Igen (</w:t>
+            </w:r>
+            <w:proofErr w:type="spellStart"/>
+            <w:r>
+              <w:rPr>
+                <w:rFonts w:ascii="Times New Roman" w:eastAsia="Times New Roman" w:hAnsi="Times New Roman" w:cs="Times New Roman"/>
+                <w:kern w:val="0"/>
+                <w:lang w:eastAsia="hu-HU"/>
+                <w14:ligatures w14:val="none"/>
+              </w:rPr>
+              <w:t>admin</w:t>
+            </w:r>
+            <w:proofErr w:type="spellEnd"/>
+            <w:r>
+              <w:rPr>
+                <w:rFonts w:ascii="Times New Roman" w:eastAsia="Times New Roman" w:hAnsi="Times New Roman" w:cs="Times New Roman"/>
+                <w:kern w:val="0"/>
+                <w:lang w:eastAsia="hu-HU"/>
+                <w14:ligatures w14:val="none"/>
+              </w:rPr>
+              <w:t>)</w:t>
+            </w:r>
+          </w:p>
+        </w:tc>
+      </w:tr>
+      <w:tr>
+        <w:trPr>
+          <w:tblCellSpacing w:w="15" w:type="dxa"/>
+        </w:trPr>
+        <w:tc>
+          <w:tcPr>
+            <w:tcW w:w="0" w:type="auto"/>
+            <w:vAlign w:val="center"/>
+            <w:hideMark/>
+          </w:tcPr>
+          <w:p>
+            <w:pPr>
+              <w:spacing w:after="0" w:line="240" w:lineRule="auto"/>
+              <w:rPr>
+                <w:rFonts w:ascii="Times New Roman" w:eastAsia="Times New Roman" w:hAnsi="Times New Roman" w:cs="Times New Roman"/>
+                <w:kern w:val="0"/>
+                <w:lang w:eastAsia="hu-HU"/>
+                <w14:ligatures w14:val="none"/>
+              </w:rPr>
+            </w:pPr>
+            <w:r>
+              <w:rPr>
+                <w:rFonts w:ascii="Times New Roman" w:eastAsia="Times New Roman" w:hAnsi="Times New Roman" w:cs="Times New Roman"/>
+                <w:kern w:val="0"/>
+                <w:lang w:eastAsia="hu-HU"/>
+                <w14:ligatures w14:val="none"/>
+              </w:rPr>
+              <w:t>GET</w:t>
+            </w:r>
+          </w:p>
+        </w:tc>
+        <w:tc>
+          <w:tcPr>
+            <w:tcW w:w="0" w:type="auto"/>
+            <w:vAlign w:val="center"/>
+            <w:hideMark/>
+          </w:tcPr>
+          <w:p>
+            <w:pPr>
+              <w:spacing w:after="0" w:line="240" w:lineRule="auto"/>
+              <w:rPr>
+                <w:rFonts w:ascii="Times New Roman" w:eastAsia="Times New Roman" w:hAnsi="Times New Roman" w:cs="Times New Roman"/>
+                <w:kern w:val="0"/>
+                <w:lang w:eastAsia="hu-HU"/>
+                <w14:ligatures w14:val="none"/>
+              </w:rPr>
+            </w:pPr>
+            <w:proofErr w:type="spellStart"/>
+            <w:r>
+              <w:rPr>
+                <w:rFonts w:ascii="Times New Roman" w:eastAsia="Times New Roman" w:hAnsi="Times New Roman" w:cs="Times New Roman"/>
+                <w:kern w:val="0"/>
+                <w:lang w:eastAsia="hu-HU"/>
+                <w14:ligatures w14:val="none"/>
+              </w:rPr>
+              <w:t>api</w:t>
+            </w:r>
+            <w:proofErr w:type="spellEnd"/>
+            <w:r>
+              <w:rPr>
+                <w:rFonts w:ascii="Times New Roman" w:eastAsia="Times New Roman" w:hAnsi="Times New Roman" w:cs="Times New Roman"/>
+                <w:kern w:val="0"/>
+                <w:lang w:eastAsia="hu-HU"/>
+                <w14:ligatures w14:val="none"/>
+              </w:rPr>
+              <w:t>/</w:t>
+            </w:r>
+            <w:proofErr w:type="spellStart"/>
+            <w:r>
+              <w:rPr>
+                <w:rFonts w:ascii="Times New Roman" w:eastAsia="Times New Roman" w:hAnsi="Times New Roman" w:cs="Times New Roman"/>
+                <w:kern w:val="0"/>
+                <w:lang w:eastAsia="hu-HU"/>
+                <w14:ligatures w14:val="none"/>
+              </w:rPr>
+              <w:t>admin</w:t>
+            </w:r>
+            <w:proofErr w:type="spellEnd"/>
+            <w:r>
+              <w:rPr>
+                <w:rFonts w:ascii="Times New Roman" w:eastAsia="Times New Roman" w:hAnsi="Times New Roman" w:cs="Times New Roman"/>
+                <w:kern w:val="0"/>
+                <w:lang w:eastAsia="hu-HU"/>
+                <w14:ligatures w14:val="none"/>
+              </w:rPr>
+              <w:t>/</w:t>
+            </w:r>
+            <w:proofErr w:type="spellStart"/>
+            <w:r>
+              <w:rPr>
+                <w:rFonts w:ascii="Times New Roman" w:eastAsia="Times New Roman" w:hAnsi="Times New Roman" w:cs="Times New Roman"/>
+                <w:kern w:val="0"/>
+                <w:lang w:eastAsia="hu-HU"/>
+                <w14:ligatures w14:val="none"/>
+              </w:rPr>
+              <w:t>users</w:t>
+            </w:r>
+            <w:proofErr w:type="spellEnd"/>
+          </w:p>
+        </w:tc>
+        <w:tc>
+          <w:tcPr>
+            <w:tcW w:w="0" w:type="auto"/>
+            <w:vAlign w:val="center"/>
+            <w:hideMark/>
+          </w:tcPr>
+          <w:p>
+            <w:pPr>
+              <w:spacing w:after="0" w:line="240" w:lineRule="auto"/>
+              <w:rPr>
+                <w:rFonts w:ascii="Times New Roman" w:eastAsia="Times New Roman" w:hAnsi="Times New Roman" w:cs="Times New Roman"/>
+                <w:kern w:val="0"/>
+                <w:lang w:eastAsia="hu-HU"/>
+                <w14:ligatures w14:val="none"/>
+              </w:rPr>
+            </w:pPr>
+            <w:r>
+              <w:rPr>
+                <w:rFonts w:ascii="Times New Roman" w:eastAsia="Times New Roman" w:hAnsi="Times New Roman" w:cs="Times New Roman"/>
+                <w:kern w:val="0"/>
+                <w:lang w:eastAsia="hu-HU"/>
+                <w14:ligatures w14:val="none"/>
+              </w:rPr>
+              <w:t>Felhasználók listázása</w:t>
+            </w:r>
+          </w:p>
+        </w:tc>
+        <w:tc>
+          <w:tcPr>
+            <w:tcW w:w="0" w:type="auto"/>
+            <w:vAlign w:val="center"/>
+            <w:hideMark/>
+          </w:tcPr>
+          <w:p>
+            <w:pPr>
+              <w:spacing w:after="0" w:line="240" w:lineRule="auto"/>
+              <w:rPr>
+                <w:rFonts w:ascii="Times New Roman" w:eastAsia="Times New Roman" w:hAnsi="Times New Roman" w:cs="Times New Roman"/>
+                <w:kern w:val="0"/>
+                <w:lang w:eastAsia="hu-HU"/>
+                <w14:ligatures w14:val="none"/>
+              </w:rPr>
+            </w:pPr>
+            <w:r>
+              <w:rPr>
+                <w:rFonts w:ascii="Times New Roman" w:eastAsia="Times New Roman" w:hAnsi="Times New Roman" w:cs="Times New Roman"/>
+                <w:kern w:val="0"/>
+                <w:lang w:eastAsia="hu-HU"/>
+                <w14:ligatures w14:val="none"/>
+              </w:rPr>
+              <w:t>Igen (</w:t>
+            </w:r>
+            <w:proofErr w:type="spellStart"/>
+            <w:r>
+              <w:rPr>
+                <w:rFonts w:ascii="Times New Roman" w:eastAsia="Times New Roman" w:hAnsi="Times New Roman" w:cs="Times New Roman"/>
+                <w:kern w:val="0"/>
+                <w:lang w:eastAsia="hu-HU"/>
+                <w14:ligatures w14:val="none"/>
+              </w:rPr>
+              <w:t>admin</w:t>
+            </w:r>
+            <w:proofErr w:type="spellEnd"/>
+            <w:r>
+              <w:rPr>
+                <w:rFonts w:ascii="Times New Roman" w:eastAsia="Times New Roman" w:hAnsi="Times New Roman" w:cs="Times New Roman"/>
+                <w:kern w:val="0"/>
+                <w:lang w:eastAsia="hu-HU"/>
+                <w14:ligatures w14:val="none"/>
+              </w:rPr>
+              <w:t>)</w:t>
+            </w:r>
+          </w:p>
+        </w:tc>
+      </w:tr>
+      <w:tr>
+        <w:trPr>
+          <w:tblCellSpacing w:w="15" w:type="dxa"/>
+        </w:trPr>
+        <w:tc>
+          <w:tcPr>
+            <w:tcW w:w="0" w:type="auto"/>
+            <w:vAlign w:val="center"/>
+            <w:hideMark/>
+          </w:tcPr>
+          <w:p>
+            <w:pPr>
+              <w:spacing w:after="0" w:line="240" w:lineRule="auto"/>
+              <w:rPr>
+                <w:rFonts w:ascii="Times New Roman" w:eastAsia="Times New Roman" w:hAnsi="Times New Roman" w:cs="Times New Roman"/>
+                <w:kern w:val="0"/>
+                <w:lang w:eastAsia="hu-HU"/>
+                <w14:ligatures w14:val="none"/>
+              </w:rPr>
+            </w:pPr>
+            <w:r>
+              <w:rPr>
+                <w:rFonts w:ascii="Times New Roman" w:eastAsia="Times New Roman" w:hAnsi="Times New Roman" w:cs="Times New Roman"/>
+                <w:kern w:val="0"/>
+                <w:lang w:eastAsia="hu-HU"/>
+                <w14:ligatures w14:val="none"/>
+              </w:rPr>
+              <w:t>POST</w:t>
+            </w:r>
+          </w:p>
+        </w:tc>
+        <w:tc>
+          <w:tcPr>
+            <w:tcW w:w="0" w:type="auto"/>
+            <w:vAlign w:val="center"/>
+            <w:hideMark/>
+          </w:tcPr>
+          <w:p>
+            <w:pPr>
+              <w:spacing w:after="0" w:line="240" w:lineRule="auto"/>
+              <w:rPr>
+                <w:rFonts w:ascii="Times New Roman" w:eastAsia="Times New Roman" w:hAnsi="Times New Roman" w:cs="Times New Roman"/>
+                <w:kern w:val="0"/>
+                <w:lang w:eastAsia="hu-HU"/>
+                <w14:ligatures w14:val="none"/>
+              </w:rPr>
+            </w:pPr>
+            <w:proofErr w:type="spellStart"/>
+            <w:r>
+              <w:rPr>
+                <w:rFonts w:ascii="Times New Roman" w:eastAsia="Times New Roman" w:hAnsi="Times New Roman" w:cs="Times New Roman"/>
+                <w:kern w:val="0"/>
+                <w:lang w:eastAsia="hu-HU"/>
+                <w14:ligatures w14:val="none"/>
+              </w:rPr>
+              <w:t>api</w:t>
+            </w:r>
+            <w:proofErr w:type="spellEnd"/>
+            <w:r>
+              <w:rPr>
+                <w:rFonts w:ascii="Times New Roman" w:eastAsia="Times New Roman" w:hAnsi="Times New Roman" w:cs="Times New Roman"/>
+                <w:kern w:val="0"/>
+                <w:lang w:eastAsia="hu-HU"/>
+                <w14:ligatures w14:val="none"/>
+              </w:rPr>
+              <w:t>/</w:t>
+            </w:r>
+            <w:proofErr w:type="spellStart"/>
+            <w:r>
+              <w:rPr>
+                <w:rFonts w:ascii="Times New Roman" w:eastAsia="Times New Roman" w:hAnsi="Times New Roman" w:cs="Times New Roman"/>
+                <w:kern w:val="0"/>
+                <w:lang w:eastAsia="hu-HU"/>
+                <w14:ligatures w14:val="none"/>
+              </w:rPr>
+              <w:t>admin</w:t>
+            </w:r>
+            <w:proofErr w:type="spellEnd"/>
+            <w:r>
+              <w:rPr>
+                <w:rFonts w:ascii="Times New Roman" w:eastAsia="Times New Roman" w:hAnsi="Times New Roman" w:cs="Times New Roman"/>
+                <w:kern w:val="0"/>
+                <w:lang w:eastAsia="hu-HU"/>
+                <w14:ligatures w14:val="none"/>
+              </w:rPr>
+              <w:t>/</w:t>
+            </w:r>
+            <w:proofErr w:type="spellStart"/>
+            <w:r>
+              <w:rPr>
+                <w:rFonts w:ascii="Times New Roman" w:eastAsia="Times New Roman" w:hAnsi="Times New Roman" w:cs="Times New Roman"/>
+                <w:kern w:val="0"/>
+                <w:lang w:eastAsia="hu-HU"/>
+                <w14:ligatures w14:val="none"/>
+              </w:rPr>
+              <w:t>subjects</w:t>
+            </w:r>
+            <w:proofErr w:type="spellEnd"/>
+          </w:p>
+        </w:tc>
+        <w:tc>
+          <w:tcPr>
+            <w:tcW w:w="0" w:type="auto"/>
+            <w:vAlign w:val="center"/>
+            <w:hideMark/>
+          </w:tcPr>
+          <w:p>
+            <w:pPr>
+              <w:spacing w:after="0" w:line="240" w:lineRule="auto"/>
+              <w:rPr>
+                <w:rFonts w:ascii="Times New Roman" w:eastAsia="Times New Roman" w:hAnsi="Times New Roman" w:cs="Times New Roman"/>
+                <w:kern w:val="0"/>
+                <w:lang w:eastAsia="hu-HU"/>
+                <w14:ligatures w14:val="none"/>
+              </w:rPr>
+            </w:pPr>
+            <w:r>
+              <w:rPr>
+                <w:rFonts w:ascii="Times New Roman" w:eastAsia="Times New Roman" w:hAnsi="Times New Roman" w:cs="Times New Roman"/>
+                <w:kern w:val="0"/>
+                <w:lang w:eastAsia="hu-HU"/>
+                <w14:ligatures w14:val="none"/>
+              </w:rPr>
+              <w:t>Új tantárgy létrehozása</w:t>
+            </w:r>
+          </w:p>
+        </w:tc>
+        <w:tc>
+          <w:tcPr>
+            <w:tcW w:w="0" w:type="auto"/>
+            <w:vAlign w:val="center"/>
+            <w:hideMark/>
+          </w:tcPr>
+          <w:p>
+            <w:pPr>
+              <w:spacing w:after="0" w:line="240" w:lineRule="auto"/>
+              <w:rPr>
+                <w:rFonts w:ascii="Times New Roman" w:eastAsia="Times New Roman" w:hAnsi="Times New Roman" w:cs="Times New Roman"/>
+                <w:kern w:val="0"/>
+                <w:lang w:eastAsia="hu-HU"/>
+                <w14:ligatures w14:val="none"/>
+              </w:rPr>
+            </w:pPr>
+            <w:r>
+              <w:rPr>
+                <w:rFonts w:ascii="Times New Roman" w:eastAsia="Times New Roman" w:hAnsi="Times New Roman" w:cs="Times New Roman"/>
+                <w:kern w:val="0"/>
+                <w:lang w:eastAsia="hu-HU"/>
+                <w14:ligatures w14:val="none"/>
+              </w:rPr>
+              <w:t>Igen (</w:t>
+            </w:r>
+            <w:proofErr w:type="spellStart"/>
+            <w:r>
+              <w:rPr>
+                <w:rFonts w:ascii="Times New Roman" w:eastAsia="Times New Roman" w:hAnsi="Times New Roman" w:cs="Times New Roman"/>
+                <w:kern w:val="0"/>
+                <w:lang w:eastAsia="hu-HU"/>
+                <w14:ligatures w14:val="none"/>
+              </w:rPr>
+              <w:t>admin</w:t>
+            </w:r>
+            <w:proofErr w:type="spellEnd"/>
+            <w:r>
+              <w:rPr>
+                <w:rFonts w:ascii="Times New Roman" w:eastAsia="Times New Roman" w:hAnsi="Times New Roman" w:cs="Times New Roman"/>
+                <w:kern w:val="0"/>
+                <w:lang w:eastAsia="hu-HU"/>
+                <w14:ligatures w14:val="none"/>
+              </w:rPr>
+              <w:t>)</w:t>
+            </w:r>
+          </w:p>
+        </w:tc>
+      </w:tr>
+      <w:tr>
+        <w:trPr>
+          <w:tblCellSpacing w:w="15" w:type="dxa"/>
+        </w:trPr>
+        <w:tc>
+          <w:tcPr>
+            <w:tcW w:w="0" w:type="auto"/>
+            <w:vAlign w:val="center"/>
+            <w:hideMark/>
+          </w:tcPr>
+          <w:p>
+            <w:pPr>
+              <w:spacing w:after="0" w:line="240" w:lineRule="auto"/>
+              <w:rPr>
+                <w:rFonts w:ascii="Times New Roman" w:eastAsia="Times New Roman" w:hAnsi="Times New Roman" w:cs="Times New Roman"/>
+                <w:kern w:val="0"/>
+                <w:lang w:eastAsia="hu-HU"/>
+                <w14:ligatures w14:val="none"/>
+              </w:rPr>
+            </w:pPr>
+            <w:r>
+              <w:rPr>
+                <w:rFonts w:ascii="Times New Roman" w:eastAsia="Times New Roman" w:hAnsi="Times New Roman" w:cs="Times New Roman"/>
+                <w:kern w:val="0"/>
+                <w:lang w:eastAsia="hu-HU"/>
+                <w14:ligatures w14:val="none"/>
+              </w:rPr>
+              <w:t>DELETE</w:t>
+            </w:r>
+          </w:p>
+        </w:tc>
+        <w:tc>
+          <w:tcPr>
+            <w:tcW w:w="0" w:type="auto"/>
+            <w:vAlign w:val="center"/>
+            <w:hideMark/>
+          </w:tcPr>
+          <w:p>
+            <w:pPr>
+              <w:spacing w:after="0" w:line="240" w:lineRule="auto"/>
+              <w:rPr>
+                <w:rFonts w:ascii="Times New Roman" w:eastAsia="Times New Roman" w:hAnsi="Times New Roman" w:cs="Times New Roman"/>
+                <w:kern w:val="0"/>
+                <w:lang w:eastAsia="hu-HU"/>
+                <w14:ligatures w14:val="none"/>
+              </w:rPr>
+            </w:pPr>
+            <w:proofErr w:type="spellStart"/>
+            <w:r>
+              <w:rPr>
+                <w:rFonts w:ascii="Times New Roman" w:eastAsia="Times New Roman" w:hAnsi="Times New Roman" w:cs="Times New Roman"/>
+                <w:kern w:val="0"/>
+                <w:lang w:eastAsia="hu-HU"/>
+                <w14:ligatures w14:val="none"/>
+              </w:rPr>
+              <w:t>api</w:t>
+            </w:r>
+            <w:proofErr w:type="spellEnd"/>
+            <w:r>
+              <w:rPr>
+                <w:rFonts w:ascii="Times New Roman" w:eastAsia="Times New Roman" w:hAnsi="Times New Roman" w:cs="Times New Roman"/>
+                <w:kern w:val="0"/>
+                <w:lang w:eastAsia="hu-HU"/>
+                <w14:ligatures w14:val="none"/>
+              </w:rPr>
+              <w:t>/</w:t>
+            </w:r>
+            <w:proofErr w:type="spellStart"/>
+            <w:r>
+              <w:rPr>
+                <w:rFonts w:ascii="Times New Roman" w:eastAsia="Times New Roman" w:hAnsi="Times New Roman" w:cs="Times New Roman"/>
+                <w:kern w:val="0"/>
+                <w:lang w:eastAsia="hu-HU"/>
+                <w14:ligatures w14:val="none"/>
+              </w:rPr>
+              <w:t>admin</w:t>
+            </w:r>
+            <w:proofErr w:type="spellEnd"/>
+            <w:r>
+              <w:rPr>
+                <w:rFonts w:ascii="Times New Roman" w:eastAsia="Times New Roman" w:hAnsi="Times New Roman" w:cs="Times New Roman"/>
+                <w:kern w:val="0"/>
+                <w:lang w:eastAsia="hu-HU"/>
+                <w14:ligatures w14:val="none"/>
+              </w:rPr>
+              <w:t>/</w:t>
+            </w:r>
+            <w:proofErr w:type="spellStart"/>
+            <w:r>
+              <w:rPr>
+                <w:rFonts w:ascii="Times New Roman" w:eastAsia="Times New Roman" w:hAnsi="Times New Roman" w:cs="Times New Roman"/>
+                <w:kern w:val="0"/>
+                <w:lang w:eastAsia="hu-HU"/>
+                <w14:ligatures w14:val="none"/>
+              </w:rPr>
+              <w:t>subjects</w:t>
+            </w:r>
+            <w:proofErr w:type="spellEnd"/>
+            <w:r>
+              <w:rPr>
+                <w:rFonts w:ascii="Times New Roman" w:eastAsia="Times New Roman" w:hAnsi="Times New Roman" w:cs="Times New Roman"/>
+                <w:kern w:val="0"/>
+                <w:lang w:eastAsia="hu-HU"/>
+                <w14:ligatures w14:val="none"/>
+              </w:rPr>
+              <w:t>/{</w:t>
+            </w:r>
+            <w:proofErr w:type="spellStart"/>
+            <w:r>
+              <w:rPr>
+                <w:rFonts w:ascii="Times New Roman" w:eastAsia="Times New Roman" w:hAnsi="Times New Roman" w:cs="Times New Roman"/>
+                <w:kern w:val="0"/>
+                <w:lang w:eastAsia="hu-HU"/>
+                <w14:ligatures w14:val="none"/>
+              </w:rPr>
+              <w:t>subject</w:t>
+            </w:r>
+            <w:proofErr w:type="spellEnd"/>
+            <w:r>
+              <w:rPr>
+                <w:rFonts w:ascii="Times New Roman" w:eastAsia="Times New Roman" w:hAnsi="Times New Roman" w:cs="Times New Roman"/>
+                <w:kern w:val="0"/>
+                <w:lang w:eastAsia="hu-HU"/>
+                <w14:ligatures w14:val="none"/>
+              </w:rPr>
+              <w:t>}</w:t>
+            </w:r>
+          </w:p>
+        </w:tc>
+        <w:tc>
+          <w:tcPr>
+            <w:tcW w:w="0" w:type="auto"/>
+            <w:vAlign w:val="center"/>
+            <w:hideMark/>
+          </w:tcPr>
+          <w:p>
+            <w:pPr>
+              <w:spacing w:after="0" w:line="240" w:lineRule="auto"/>
+              <w:rPr>
+                <w:rFonts w:ascii="Times New Roman" w:eastAsia="Times New Roman" w:hAnsi="Times New Roman" w:cs="Times New Roman"/>
+                <w:kern w:val="0"/>
+                <w:lang w:eastAsia="hu-HU"/>
+                <w14:ligatures w14:val="none"/>
+              </w:rPr>
+            </w:pPr>
+            <w:r>
+              <w:rPr>
+                <w:rFonts w:ascii="Times New Roman" w:eastAsia="Times New Roman" w:hAnsi="Times New Roman" w:cs="Times New Roman"/>
+                <w:kern w:val="0"/>
+                <w:lang w:eastAsia="hu-HU"/>
+                <w14:ligatures w14:val="none"/>
+              </w:rPr>
+              <w:t>Tantárgy törlése</w:t>
+            </w:r>
+          </w:p>
+        </w:tc>
+        <w:tc>
+          <w:tcPr>
+            <w:tcW w:w="0" w:type="auto"/>
+            <w:vAlign w:val="center"/>
+            <w:hideMark/>
+          </w:tcPr>
+          <w:p>
+            <w:pPr>
+              <w:spacing w:after="0" w:line="240" w:lineRule="auto"/>
+              <w:rPr>
+                <w:rFonts w:ascii="Times New Roman" w:eastAsia="Times New Roman" w:hAnsi="Times New Roman" w:cs="Times New Roman"/>
+                <w:kern w:val="0"/>
+                <w:lang w:eastAsia="hu-HU"/>
+                <w14:ligatures w14:val="none"/>
+              </w:rPr>
+            </w:pPr>
+            <w:r>
+              <w:rPr>
+                <w:rFonts w:ascii="Times New Roman" w:eastAsia="Times New Roman" w:hAnsi="Times New Roman" w:cs="Times New Roman"/>
+                <w:kern w:val="0"/>
+                <w:lang w:eastAsia="hu-HU"/>
+                <w14:ligatures w14:val="none"/>
+              </w:rPr>
+              <w:t>Igen (</w:t>
+            </w:r>
+            <w:proofErr w:type="spellStart"/>
+            <w:r>
+              <w:rPr>
+                <w:rFonts w:ascii="Times New Roman" w:eastAsia="Times New Roman" w:hAnsi="Times New Roman" w:cs="Times New Roman"/>
+                <w:kern w:val="0"/>
+                <w:lang w:eastAsia="hu-HU"/>
+                <w14:ligatures w14:val="none"/>
+              </w:rPr>
+              <w:t>admin</w:t>
+            </w:r>
+            <w:proofErr w:type="spellEnd"/>
+            <w:r>
+              <w:rPr>
+                <w:rFonts w:ascii="Times New Roman" w:eastAsia="Times New Roman" w:hAnsi="Times New Roman" w:cs="Times New Roman"/>
+                <w:kern w:val="0"/>
+                <w:lang w:eastAsia="hu-HU"/>
+                <w14:ligatures w14:val="none"/>
+              </w:rPr>
+              <w:t>)</w:t>
+            </w:r>
+          </w:p>
+        </w:tc>
+      </w:tr>
+      <w:tr>
+        <w:trPr>
+          <w:tblCellSpacing w:w="15" w:type="dxa"/>
+        </w:trPr>
+        <w:tc>
+          <w:tcPr>
+            <w:tcW w:w="0" w:type="auto"/>
+            <w:vAlign w:val="center"/>
+            <w:hideMark/>
+          </w:tcPr>
+          <w:p>
+            <w:pPr>
+              <w:spacing w:after="0" w:line="240" w:lineRule="auto"/>
+              <w:rPr>
+                <w:rFonts w:ascii="Times New Roman" w:eastAsia="Times New Roman" w:hAnsi="Times New Roman" w:cs="Times New Roman"/>
+                <w:kern w:val="0"/>
+                <w:lang w:eastAsia="hu-HU"/>
+                <w14:ligatures w14:val="none"/>
+              </w:rPr>
+            </w:pPr>
+            <w:r>
+              <w:rPr>
+                <w:rFonts w:ascii="Times New Roman" w:eastAsia="Times New Roman" w:hAnsi="Times New Roman" w:cs="Times New Roman"/>
+                <w:kern w:val="0"/>
+                <w:lang w:eastAsia="hu-HU"/>
+                <w14:ligatures w14:val="none"/>
+              </w:rPr>
+              <w:t>POST</w:t>
+            </w:r>
+          </w:p>
+        </w:tc>
+        <w:tc>
+          <w:tcPr>
+            <w:tcW w:w="0" w:type="auto"/>
+            <w:vAlign w:val="center"/>
+            <w:hideMark/>
+          </w:tcPr>
+          <w:p>
+            <w:pPr>
+              <w:spacing w:after="0" w:line="240" w:lineRule="auto"/>
+              <w:rPr>
+                <w:rFonts w:ascii="Times New Roman" w:eastAsia="Times New Roman" w:hAnsi="Times New Roman" w:cs="Times New Roman"/>
+                <w:kern w:val="0"/>
+                <w:lang w:eastAsia="hu-HU"/>
+                <w14:ligatures w14:val="none"/>
+              </w:rPr>
+            </w:pPr>
+            <w:proofErr w:type="spellStart"/>
+            <w:r>
+              <w:rPr>
+                <w:rFonts w:ascii="Times New Roman" w:eastAsia="Times New Roman" w:hAnsi="Times New Roman" w:cs="Times New Roman"/>
+                <w:kern w:val="0"/>
+                <w:lang w:eastAsia="hu-HU"/>
+                <w14:ligatures w14:val="none"/>
+              </w:rPr>
+              <w:t>api</w:t>
+            </w:r>
+            <w:proofErr w:type="spellEnd"/>
+            <w:r>
+              <w:rPr>
+                <w:rFonts w:ascii="Times New Roman" w:eastAsia="Times New Roman" w:hAnsi="Times New Roman" w:cs="Times New Roman"/>
+                <w:kern w:val="0"/>
+                <w:lang w:eastAsia="hu-HU"/>
+                <w14:ligatures w14:val="none"/>
+              </w:rPr>
+              <w:t>/</w:t>
+            </w:r>
+            <w:proofErr w:type="spellStart"/>
+            <w:r>
+              <w:rPr>
+                <w:rFonts w:ascii="Times New Roman" w:eastAsia="Times New Roman" w:hAnsi="Times New Roman" w:cs="Times New Roman"/>
+                <w:kern w:val="0"/>
+                <w:lang w:eastAsia="hu-HU"/>
+                <w14:ligatures w14:val="none"/>
+              </w:rPr>
+              <w:t>admin</w:t>
+            </w:r>
+            <w:proofErr w:type="spellEnd"/>
+            <w:r>
+              <w:rPr>
+                <w:rFonts w:ascii="Times New Roman" w:eastAsia="Times New Roman" w:hAnsi="Times New Roman" w:cs="Times New Roman"/>
+                <w:kern w:val="0"/>
+                <w:lang w:eastAsia="hu-HU"/>
+                <w14:ligatures w14:val="none"/>
+              </w:rPr>
+              <w:t>/</w:t>
+            </w:r>
+            <w:proofErr w:type="spellStart"/>
+            <w:r>
+              <w:rPr>
+                <w:rFonts w:ascii="Times New Roman" w:eastAsia="Times New Roman" w:hAnsi="Times New Roman" w:cs="Times New Roman"/>
+                <w:kern w:val="0"/>
+                <w:lang w:eastAsia="hu-HU"/>
+                <w14:ligatures w14:val="none"/>
+              </w:rPr>
+              <w:t>units</w:t>
+            </w:r>
+            <w:proofErr w:type="spellEnd"/>
+            <w:r>
+              <w:rPr>
+                <w:rFonts w:ascii="Times New Roman" w:eastAsia="Times New Roman" w:hAnsi="Times New Roman" w:cs="Times New Roman"/>
+                <w:kern w:val="0"/>
+                <w:lang w:eastAsia="hu-HU"/>
+                <w14:ligatures w14:val="none"/>
+              </w:rPr>
+              <w:t>/{unit}/</w:t>
+            </w:r>
+            <w:proofErr w:type="spellStart"/>
+            <w:r>
+              <w:rPr>
+                <w:rFonts w:ascii="Times New Roman" w:eastAsia="Times New Roman" w:hAnsi="Times New Roman" w:cs="Times New Roman"/>
+                <w:kern w:val="0"/>
+                <w:lang w:eastAsia="hu-HU"/>
+                <w14:ligatures w14:val="none"/>
+              </w:rPr>
+              <w:t>topics</w:t>
+            </w:r>
+            <w:proofErr w:type="spellEnd"/>
+          </w:p>
+        </w:tc>
+        <w:tc>
+          <w:tcPr>
+            <w:tcW w:w="0" w:type="auto"/>
+            <w:vAlign w:val="center"/>
+            <w:hideMark/>
+          </w:tcPr>
+          <w:p>
+            <w:pPr>
+              <w:spacing w:after="0" w:line="240" w:lineRule="auto"/>
+              <w:rPr>
+                <w:rFonts w:ascii="Times New Roman" w:eastAsia="Times New Roman" w:hAnsi="Times New Roman" w:cs="Times New Roman"/>
+                <w:kern w:val="0"/>
+                <w:lang w:eastAsia="hu-HU"/>
+                <w14:ligatures w14:val="none"/>
+              </w:rPr>
+            </w:pPr>
+            <w:r>
+              <w:rPr>
+                <w:rFonts w:ascii="Times New Roman" w:eastAsia="Times New Roman" w:hAnsi="Times New Roman" w:cs="Times New Roman"/>
+                <w:kern w:val="0"/>
+                <w:lang w:eastAsia="hu-HU"/>
+                <w14:ligatures w14:val="none"/>
+              </w:rPr>
+              <w:t>Új témakör létrehozása</w:t>
+            </w:r>
+          </w:p>
+        </w:tc>
+        <w:tc>
+          <w:tcPr>
+            <w:tcW w:w="0" w:type="auto"/>
+            <w:vAlign w:val="center"/>
+            <w:hideMark/>
+          </w:tcPr>
+          <w:p>
+            <w:pPr>
+              <w:spacing w:after="0" w:line="240" w:lineRule="auto"/>
+              <w:rPr>
+                <w:rFonts w:ascii="Times New Roman" w:eastAsia="Times New Roman" w:hAnsi="Times New Roman" w:cs="Times New Roman"/>
+                <w:kern w:val="0"/>
+                <w:lang w:eastAsia="hu-HU"/>
+                <w14:ligatures w14:val="none"/>
+              </w:rPr>
+            </w:pPr>
+            <w:r>
+              <w:rPr>
+                <w:rFonts w:ascii="Times New Roman" w:eastAsia="Times New Roman" w:hAnsi="Times New Roman" w:cs="Times New Roman"/>
+                <w:kern w:val="0"/>
+                <w:lang w:eastAsia="hu-HU"/>
+                <w14:ligatures w14:val="none"/>
+              </w:rPr>
+              <w:t>Igen (</w:t>
+            </w:r>
+            <w:proofErr w:type="spellStart"/>
+            <w:r>
+              <w:rPr>
+                <w:rFonts w:ascii="Times New Roman" w:eastAsia="Times New Roman" w:hAnsi="Times New Roman" w:cs="Times New Roman"/>
+                <w:kern w:val="0"/>
+                <w:lang w:eastAsia="hu-HU"/>
+                <w14:ligatures w14:val="none"/>
+              </w:rPr>
+              <w:t>admin</w:t>
+            </w:r>
+            <w:proofErr w:type="spellEnd"/>
+            <w:r>
+              <w:rPr>
+                <w:rFonts w:ascii="Times New Roman" w:eastAsia="Times New Roman" w:hAnsi="Times New Roman" w:cs="Times New Roman"/>
+                <w:kern w:val="0"/>
+                <w:lang w:eastAsia="hu-HU"/>
+                <w14:ligatures w14:val="none"/>
+              </w:rPr>
+              <w:t>)</w:t>
+            </w:r>
+          </w:p>
+        </w:tc>
+      </w:tr>
+      <w:tr>
+        <w:trPr>
+          <w:tblCellSpacing w:w="15" w:type="dxa"/>
+        </w:trPr>
+        <w:tc>
+          <w:tcPr>
+            <w:tcW w:w="0" w:type="auto"/>
+            <w:vAlign w:val="center"/>
+            <w:hideMark/>
+          </w:tcPr>
+          <w:p>
+            <w:pPr>
+              <w:spacing w:after="0" w:line="240" w:lineRule="auto"/>
+              <w:rPr>
+                <w:rFonts w:ascii="Times New Roman" w:eastAsia="Times New Roman" w:hAnsi="Times New Roman" w:cs="Times New Roman"/>
+                <w:kern w:val="0"/>
+                <w:lang w:eastAsia="hu-HU"/>
+                <w14:ligatures w14:val="none"/>
+              </w:rPr>
+            </w:pPr>
+            <w:r>
+              <w:rPr>
+                <w:rFonts w:ascii="Times New Roman" w:eastAsia="Times New Roman" w:hAnsi="Times New Roman" w:cs="Times New Roman"/>
+                <w:kern w:val="0"/>
+                <w:lang w:eastAsia="hu-HU"/>
+                <w14:ligatures w14:val="none"/>
+              </w:rPr>
+              <w:t>POST</w:t>
+            </w:r>
+          </w:p>
+        </w:tc>
+        <w:tc>
+          <w:tcPr>
+            <w:tcW w:w="0" w:type="auto"/>
+            <w:vAlign w:val="center"/>
+            <w:hideMark/>
+          </w:tcPr>
+          <w:p>
+            <w:pPr>
+              <w:spacing w:after="0" w:line="240" w:lineRule="auto"/>
+              <w:rPr>
+                <w:rFonts w:ascii="Times New Roman" w:eastAsia="Times New Roman" w:hAnsi="Times New Roman" w:cs="Times New Roman"/>
+                <w:kern w:val="0"/>
+                <w:lang w:eastAsia="hu-HU"/>
+                <w14:ligatures w14:val="none"/>
+              </w:rPr>
+            </w:pPr>
+            <w:proofErr w:type="spellStart"/>
+            <w:r>
+              <w:rPr>
+                <w:rFonts w:ascii="Times New Roman" w:eastAsia="Times New Roman" w:hAnsi="Times New Roman" w:cs="Times New Roman"/>
+                <w:kern w:val="0"/>
+                <w:lang w:eastAsia="hu-HU"/>
+                <w14:ligatures w14:val="none"/>
+              </w:rPr>
+              <w:t>api</w:t>
+            </w:r>
+            <w:proofErr w:type="spellEnd"/>
+            <w:r>
+              <w:rPr>
+                <w:rFonts w:ascii="Times New Roman" w:eastAsia="Times New Roman" w:hAnsi="Times New Roman" w:cs="Times New Roman"/>
+                <w:kern w:val="0"/>
+                <w:lang w:eastAsia="hu-HU"/>
+                <w14:ligatures w14:val="none"/>
+              </w:rPr>
+              <w:t>/</w:t>
+            </w:r>
+            <w:proofErr w:type="spellStart"/>
+            <w:r>
+              <w:rPr>
+                <w:rFonts w:ascii="Times New Roman" w:eastAsia="Times New Roman" w:hAnsi="Times New Roman" w:cs="Times New Roman"/>
+                <w:kern w:val="0"/>
+                <w:lang w:eastAsia="hu-HU"/>
+                <w14:ligatures w14:val="none"/>
+              </w:rPr>
+              <w:t>admin</w:t>
+            </w:r>
+            <w:proofErr w:type="spellEnd"/>
+            <w:r>
+              <w:rPr>
+                <w:rFonts w:ascii="Times New Roman" w:eastAsia="Times New Roman" w:hAnsi="Times New Roman" w:cs="Times New Roman"/>
+                <w:kern w:val="0"/>
+                <w:lang w:eastAsia="hu-HU"/>
+                <w14:ligatures w14:val="none"/>
+              </w:rPr>
+              <w:t>/</w:t>
+            </w:r>
+            <w:proofErr w:type="spellStart"/>
+            <w:r>
+              <w:rPr>
+                <w:rFonts w:ascii="Times New Roman" w:eastAsia="Times New Roman" w:hAnsi="Times New Roman" w:cs="Times New Roman"/>
+                <w:kern w:val="0"/>
+                <w:lang w:eastAsia="hu-HU"/>
+                <w14:ligatures w14:val="none"/>
+              </w:rPr>
+              <w:t>topics</w:t>
+            </w:r>
+            <w:proofErr w:type="spellEnd"/>
+            <w:r>
+              <w:rPr>
+                <w:rFonts w:ascii="Times New Roman" w:eastAsia="Times New Roman" w:hAnsi="Times New Roman" w:cs="Times New Roman"/>
+                <w:kern w:val="0"/>
+                <w:lang w:eastAsia="hu-HU"/>
+                <w14:ligatures w14:val="none"/>
+              </w:rPr>
+              <w:t>/{</w:t>
+            </w:r>
+            <w:proofErr w:type="spellStart"/>
+            <w:r>
+              <w:rPr>
+                <w:rFonts w:ascii="Times New Roman" w:eastAsia="Times New Roman" w:hAnsi="Times New Roman" w:cs="Times New Roman"/>
+                <w:kern w:val="0"/>
+                <w:lang w:eastAsia="hu-HU"/>
+                <w14:ligatures w14:val="none"/>
+              </w:rPr>
+              <w:t>topic</w:t>
+            </w:r>
+            <w:proofErr w:type="spellEnd"/>
+            <w:r>
+              <w:rPr>
+                <w:rFonts w:ascii="Times New Roman" w:eastAsia="Times New Roman" w:hAnsi="Times New Roman" w:cs="Times New Roman"/>
+                <w:kern w:val="0"/>
+                <w:lang w:eastAsia="hu-HU"/>
+                <w14:ligatures w14:val="none"/>
+              </w:rPr>
+              <w:t>}/</w:t>
+            </w:r>
+            <w:proofErr w:type="spellStart"/>
+            <w:r>
+              <w:rPr>
+                <w:rFonts w:ascii="Times New Roman" w:eastAsia="Times New Roman" w:hAnsi="Times New Roman" w:cs="Times New Roman"/>
+                <w:kern w:val="0"/>
+                <w:lang w:eastAsia="hu-HU"/>
+                <w14:ligatures w14:val="none"/>
+              </w:rPr>
+              <w:t>flashcards</w:t>
+            </w:r>
+            <w:proofErr w:type="spellEnd"/>
+          </w:p>
+        </w:tc>
+        <w:tc>
+          <w:tcPr>
+            <w:tcW w:w="0" w:type="auto"/>
+            <w:vAlign w:val="center"/>
+            <w:hideMark/>
+          </w:tcPr>
+          <w:p>
+            <w:pPr>
+              <w:spacing w:after="0" w:line="240" w:lineRule="auto"/>
+              <w:rPr>
+                <w:rFonts w:ascii="Times New Roman" w:eastAsia="Times New Roman" w:hAnsi="Times New Roman" w:cs="Times New Roman"/>
+                <w:kern w:val="0"/>
+                <w:lang w:eastAsia="hu-HU"/>
+                <w14:ligatures w14:val="none"/>
+              </w:rPr>
+            </w:pPr>
+            <w:r>
+              <w:rPr>
+                <w:rFonts w:ascii="Times New Roman" w:eastAsia="Times New Roman" w:hAnsi="Times New Roman" w:cs="Times New Roman"/>
+                <w:kern w:val="0"/>
+                <w:lang w:eastAsia="hu-HU"/>
+                <w14:ligatures w14:val="none"/>
+              </w:rPr>
+              <w:t xml:space="preserve">Új </w:t>
+            </w:r>
+            <w:proofErr w:type="spellStart"/>
+            <w:r>
+              <w:rPr>
+                <w:rFonts w:ascii="Times New Roman" w:eastAsia="Times New Roman" w:hAnsi="Times New Roman" w:cs="Times New Roman"/>
+                <w:kern w:val="0"/>
+                <w:lang w:eastAsia="hu-HU"/>
+                <w14:ligatures w14:val="none"/>
+              </w:rPr>
+              <w:t>flashcard</w:t>
+            </w:r>
+            <w:proofErr w:type="spellEnd"/>
+          </w:p>
+        </w:tc>
+        <w:tc>
+          <w:tcPr>
+            <w:tcW w:w="0" w:type="auto"/>
+            <w:vAlign w:val="center"/>
+            <w:hideMark/>
+          </w:tcPr>
+          <w:p>
+            <w:pPr>
+              <w:spacing w:after="0" w:line="240" w:lineRule="auto"/>
+              <w:rPr>
+                <w:rFonts w:ascii="Times New Roman" w:eastAsia="Times New Roman" w:hAnsi="Times New Roman" w:cs="Times New Roman"/>
+                <w:kern w:val="0"/>
+                <w:lang w:eastAsia="hu-HU"/>
+                <w14:ligatures w14:val="none"/>
+              </w:rPr>
+            </w:pPr>
+            <w:r>
+              <w:rPr>
+                <w:rFonts w:ascii="Times New Roman" w:eastAsia="Times New Roman" w:hAnsi="Times New Roman" w:cs="Times New Roman"/>
+                <w:kern w:val="0"/>
+                <w:lang w:eastAsia="hu-HU"/>
+                <w14:ligatures w14:val="none"/>
+              </w:rPr>
+              <w:t>Igen (</w:t>
+            </w:r>
+            <w:proofErr w:type="spellStart"/>
+            <w:r>
+              <w:rPr>
+                <w:rFonts w:ascii="Times New Roman" w:eastAsia="Times New Roman" w:hAnsi="Times New Roman" w:cs="Times New Roman"/>
+                <w:kern w:val="0"/>
+                <w:lang w:eastAsia="hu-HU"/>
+                <w14:ligatures w14:val="none"/>
+              </w:rPr>
+              <w:t>admin</w:t>
+            </w:r>
+            <w:proofErr w:type="spellEnd"/>
+            <w:r>
+              <w:rPr>
+                <w:rFonts w:ascii="Times New Roman" w:eastAsia="Times New Roman" w:hAnsi="Times New Roman" w:cs="Times New Roman"/>
+                <w:kern w:val="0"/>
+                <w:lang w:eastAsia="hu-HU"/>
+                <w14:ligatures w14:val="none"/>
+              </w:rPr>
+              <w:t>)</w:t>
+            </w:r>
+          </w:p>
+        </w:tc>
+      </w:tr>
+      <w:tr>
+        <w:trPr>
+          <w:tblCellSpacing w:w="15" w:type="dxa"/>
+        </w:trPr>
+        <w:tc>
+          <w:tcPr>
+            <w:tcW w:w="0" w:type="auto"/>
+            <w:vAlign w:val="center"/>
+            <w:hideMark/>
+          </w:tcPr>
+          <w:p>
+            <w:pPr>
+              <w:spacing w:after="0" w:line="240" w:lineRule="auto"/>
+              <w:rPr>
+                <w:rFonts w:ascii="Times New Roman" w:eastAsia="Times New Roman" w:hAnsi="Times New Roman" w:cs="Times New Roman"/>
+                <w:kern w:val="0"/>
+                <w:lang w:eastAsia="hu-HU"/>
+                <w14:ligatures w14:val="none"/>
+              </w:rPr>
+            </w:pPr>
+            <w:r>
+              <w:rPr>
+                <w:rFonts w:ascii="Times New Roman" w:eastAsia="Times New Roman" w:hAnsi="Times New Roman" w:cs="Times New Roman"/>
+                <w:kern w:val="0"/>
+                <w:lang w:eastAsia="hu-HU"/>
+                <w14:ligatures w14:val="none"/>
+              </w:rPr>
+              <w:t>POST</w:t>
+            </w:r>
+          </w:p>
+        </w:tc>
+        <w:tc>
+          <w:tcPr>
+            <w:tcW w:w="0" w:type="auto"/>
+            <w:vAlign w:val="center"/>
+            <w:hideMark/>
+          </w:tcPr>
+          <w:p>
+            <w:pPr>
+              <w:spacing w:after="0" w:line="240" w:lineRule="auto"/>
+              <w:rPr>
+                <w:rFonts w:ascii="Times New Roman" w:eastAsia="Times New Roman" w:hAnsi="Times New Roman" w:cs="Times New Roman"/>
+                <w:kern w:val="0"/>
+                <w:lang w:eastAsia="hu-HU"/>
+                <w14:ligatures w14:val="none"/>
+              </w:rPr>
+            </w:pPr>
+            <w:proofErr w:type="spellStart"/>
+            <w:r>
+              <w:rPr>
+                <w:rFonts w:ascii="Times New Roman" w:eastAsia="Times New Roman" w:hAnsi="Times New Roman" w:cs="Times New Roman"/>
+                <w:kern w:val="0"/>
+                <w:lang w:eastAsia="hu-HU"/>
+                <w14:ligatures w14:val="none"/>
+              </w:rPr>
+              <w:t>api</w:t>
+            </w:r>
+            <w:proofErr w:type="spellEnd"/>
+            <w:r>
+              <w:rPr>
+                <w:rFonts w:ascii="Times New Roman" w:eastAsia="Times New Roman" w:hAnsi="Times New Roman" w:cs="Times New Roman"/>
+                <w:kern w:val="0"/>
+                <w:lang w:eastAsia="hu-HU"/>
+                <w14:ligatures w14:val="none"/>
+              </w:rPr>
+              <w:t>/</w:t>
+            </w:r>
+            <w:proofErr w:type="spellStart"/>
+            <w:r>
+              <w:rPr>
+                <w:rFonts w:ascii="Times New Roman" w:eastAsia="Times New Roman" w:hAnsi="Times New Roman" w:cs="Times New Roman"/>
+                <w:kern w:val="0"/>
+                <w:lang w:eastAsia="hu-HU"/>
+                <w14:ligatures w14:val="none"/>
+              </w:rPr>
+              <w:t>admin</w:t>
+            </w:r>
+            <w:proofErr w:type="spellEnd"/>
+            <w:r>
+              <w:rPr>
+                <w:rFonts w:ascii="Times New Roman" w:eastAsia="Times New Roman" w:hAnsi="Times New Roman" w:cs="Times New Roman"/>
+                <w:kern w:val="0"/>
+                <w:lang w:eastAsia="hu-HU"/>
+                <w14:ligatures w14:val="none"/>
+              </w:rPr>
+              <w:t>/</w:t>
+            </w:r>
+            <w:proofErr w:type="spellStart"/>
+            <w:r>
+              <w:rPr>
+                <w:rFonts w:ascii="Times New Roman" w:eastAsia="Times New Roman" w:hAnsi="Times New Roman" w:cs="Times New Roman"/>
+                <w:kern w:val="0"/>
+                <w:lang w:eastAsia="hu-HU"/>
+                <w14:ligatures w14:val="none"/>
+              </w:rPr>
+              <w:t>topics</w:t>
+            </w:r>
+            <w:proofErr w:type="spellEnd"/>
+            <w:r>
+              <w:rPr>
+                <w:rFonts w:ascii="Times New Roman" w:eastAsia="Times New Roman" w:hAnsi="Times New Roman" w:cs="Times New Roman"/>
+                <w:kern w:val="0"/>
+                <w:lang w:eastAsia="hu-HU"/>
+                <w14:ligatures w14:val="none"/>
+              </w:rPr>
+              <w:t>/{</w:t>
+            </w:r>
+            <w:proofErr w:type="spellStart"/>
+            <w:r>
+              <w:rPr>
+                <w:rFonts w:ascii="Times New Roman" w:eastAsia="Times New Roman" w:hAnsi="Times New Roman" w:cs="Times New Roman"/>
+                <w:kern w:val="0"/>
+                <w:lang w:eastAsia="hu-HU"/>
+                <w14:ligatures w14:val="none"/>
+              </w:rPr>
+              <w:t>topic</w:t>
+            </w:r>
+            <w:proofErr w:type="spellEnd"/>
+            <w:r>
+              <w:rPr>
+                <w:rFonts w:ascii="Times New Roman" w:eastAsia="Times New Roman" w:hAnsi="Times New Roman" w:cs="Times New Roman"/>
+                <w:kern w:val="0"/>
+                <w:lang w:eastAsia="hu-HU"/>
+                <w14:ligatures w14:val="none"/>
+              </w:rPr>
+              <w:t>}/</w:t>
+            </w:r>
+            <w:proofErr w:type="spellStart"/>
+            <w:r>
+              <w:rPr>
+                <w:rFonts w:ascii="Times New Roman" w:eastAsia="Times New Roman" w:hAnsi="Times New Roman" w:cs="Times New Roman"/>
+                <w:kern w:val="0"/>
+                <w:lang w:eastAsia="hu-HU"/>
+                <w14:ligatures w14:val="none"/>
+              </w:rPr>
+              <w:t>questions</w:t>
+            </w:r>
+            <w:proofErr w:type="spellEnd"/>
+          </w:p>
+        </w:tc>
+        <w:tc>
+          <w:tcPr>
+            <w:tcW w:w="0" w:type="auto"/>
+            <w:vAlign w:val="center"/>
+            <w:hideMark/>
+          </w:tcPr>
+          <w:p>
+            <w:pPr>
+              <w:spacing w:after="0" w:line="240" w:lineRule="auto"/>
+              <w:rPr>
+                <w:rFonts w:ascii="Times New Roman" w:eastAsia="Times New Roman" w:hAnsi="Times New Roman" w:cs="Times New Roman"/>
+                <w:kern w:val="0"/>
+                <w:lang w:eastAsia="hu-HU"/>
+                <w14:ligatures w14:val="none"/>
+              </w:rPr>
+            </w:pPr>
+            <w:r>
+              <w:rPr>
+                <w:rFonts w:ascii="Times New Roman" w:eastAsia="Times New Roman" w:hAnsi="Times New Roman" w:cs="Times New Roman"/>
+                <w:kern w:val="0"/>
+                <w:lang w:eastAsia="hu-HU"/>
+                <w14:ligatures w14:val="none"/>
+              </w:rPr>
+              <w:t>Új kérdés</w:t>
+            </w:r>
+          </w:p>
+        </w:tc>
+        <w:tc>
+          <w:tcPr>
+            <w:tcW w:w="0" w:type="auto"/>
+            <w:vAlign w:val="center"/>
+            <w:hideMark/>
+          </w:tcPr>
+          <w:p>
+            <w:pPr>
+              <w:spacing w:after="0" w:line="240" w:lineRule="auto"/>
+              <w:rPr>
+                <w:rFonts w:ascii="Times New Roman" w:eastAsia="Times New Roman" w:hAnsi="Times New Roman" w:cs="Times New Roman"/>
+                <w:kern w:val="0"/>
+                <w:lang w:eastAsia="hu-HU"/>
+                <w14:ligatures w14:val="none"/>
+              </w:rPr>
+            </w:pPr>
+            <w:r>
+              <w:rPr>
+                <w:rFonts w:ascii="Times New Roman" w:eastAsia="Times New Roman" w:hAnsi="Times New Roman" w:cs="Times New Roman"/>
+                <w:kern w:val="0"/>
+                <w:lang w:eastAsia="hu-HU"/>
+                <w14:ligatures w14:val="none"/>
+              </w:rPr>
+              <w:t>Igen (</w:t>
+            </w:r>
+            <w:proofErr w:type="spellStart"/>
+            <w:r>
+              <w:rPr>
+                <w:rFonts w:ascii="Times New Roman" w:eastAsia="Times New Roman" w:hAnsi="Times New Roman" w:cs="Times New Roman"/>
+                <w:kern w:val="0"/>
+                <w:lang w:eastAsia="hu-HU"/>
+                <w14:ligatures w14:val="none"/>
+              </w:rPr>
+              <w:t>admin</w:t>
+            </w:r>
+            <w:proofErr w:type="spellEnd"/>
+            <w:r>
+              <w:rPr>
+                <w:rFonts w:ascii="Times New Roman" w:eastAsia="Times New Roman" w:hAnsi="Times New Roman" w:cs="Times New Roman"/>
+                <w:kern w:val="0"/>
+                <w:lang w:eastAsia="hu-HU"/>
+                <w14:ligatures w14:val="none"/>
+              </w:rPr>
+              <w:t>)</w:t>
             </w:r>
           </w:p>
         </w:tc>
@@ -6180,7 +7779,7 @@
   <w:style w:type="paragraph" w:default="1" w:styleId="Norml">
     <w:name w:val="Normal"/>
     <w:qFormat/>
-    <w:rsid w:val="008E7D0D"/>
+    <w:rsid w:val="00E65645"/>
   </w:style>
   <w:style w:type="paragraph" w:styleId="Cmsor1">
     <w:name w:val="heading 1"/>

</xml_diff>